<commit_message>
feat: simplify hotel cost splitting calculation and update UI
</commit_message>
<xml_diff>
--- a/backend/templates/Berkas Luar Kota - rincian pembayaran.docx
+++ b/backend/templates/Berkas Luar Kota - rincian pembayaran.docx
@@ -1717,6 +1717,76 @@
           <w:tcPr>
             <w:tcW w:w="1942" w:type="pct"/>
           </w:tcPr>
+          <w:tbl>
+            <w:tblPr>
+              <w:tblStyle w:val="TableGrid"/>
+              <w:tblW w:w="4988" w:type="pct"/>
+              <w:tblBorders>
+                <w:top w:val="none" w:sz="0" w:space="0" w:color="auto"/>
+                <w:left w:val="none" w:sz="0" w:space="0" w:color="auto"/>
+                <w:bottom w:val="none" w:sz="0" w:space="0" w:color="auto"/>
+                <w:right w:val="none" w:sz="0" w:space="0" w:color="auto"/>
+                <w:insideH w:val="none" w:sz="0" w:space="0" w:color="auto"/>
+                <w:insideV w:val="none" w:sz="0" w:space="0" w:color="auto"/>
+              </w:tblBorders>
+              <w:tblLook w:val="04A0" w:firstRow="1" w:lastRow="0" w:firstColumn="1" w:lastColumn="0" w:noHBand="0" w:noVBand="1"/>
+            </w:tblPr>
+            <w:tblGrid>
+              <w:gridCol w:w="4029"/>
+            </w:tblGrid>
+            <w:tr>
+              <w:tc>
+                <w:tcPr>
+                  <w:tcW w:w="5000" w:type="pct"/>
+                </w:tcPr>
+                <w:p>
+                  <w:pPr>
+                    <w:pStyle w:val="BodyText"/>
+                    <w:spacing w:line="336" w:lineRule="auto"/>
+                    <w:jc w:val="center"/>
+                  </w:pPr>
+                  <w:r>
+                    <w:t>Telah menerima</w:t>
+                  </w:r>
+                  <w:r>
+                    <w:rPr>
+                      <w:spacing w:val="-1"/>
+                    </w:rPr>
+                    <w:t xml:space="preserve"> </w:t>
+                  </w:r>
+                  <w:r>
+                    <w:t>jumlah uang sebesar</w:t>
+                  </w:r>
+                </w:p>
+              </w:tc>
+            </w:tr>
+            <w:tr>
+              <w:tc>
+                <w:tcPr>
+                  <w:tcW w:w="5000" w:type="pct"/>
+                </w:tcPr>
+                <w:p>
+                  <w:pPr>
+                    <w:pStyle w:val="BodyText"/>
+                    <w:spacing w:line="336" w:lineRule="auto"/>
+                    <w:jc w:val="center"/>
+                  </w:pPr>
+                  <w:r>
+                    <w:t>Rp.</w:t>
+                  </w:r>
+                  <w:r>
+                    <w:rPr>
+                      <w:spacing w:val="50"/>
+                    </w:rPr>
+                    <w:t xml:space="preserve"> </w:t>
+                  </w:r>
+                  <w:r>
+                    <w:t>{{total}}</w:t>
+                  </w:r>
+                </w:p>
+              </w:tc>
+            </w:tr>
+          </w:tbl>
           <w:p>
             <w:pPr>
               <w:pStyle w:val="BodyText"/>
@@ -1724,53 +1794,6 @@
               <w:ind w:right="350"/>
               <w:jc w:val="center"/>
             </w:pPr>
-            <w:r>
-              <w:t>Telah menerima</w:t>
-            </w:r>
-            <w:r>
-              <w:rPr>
-                <w:spacing w:val="-1"/>
-              </w:rPr>
-              <w:t xml:space="preserve"> </w:t>
-            </w:r>
-            <w:r>
-              <w:t>jumlah</w:t>
-            </w:r>
-            <w:r>
-              <w:t xml:space="preserve"> </w:t>
-            </w:r>
-            <w:r>
-              <w:t>uang sebesar</w:t>
-            </w:r>
-          </w:p>
-          <w:p>
-            <w:pPr>
-              <w:pStyle w:val="BodyText"/>
-              <w:spacing w:line="336" w:lineRule="auto"/>
-              <w:ind w:right="350"/>
-              <w:jc w:val="center"/>
-            </w:pPr>
-            <w:r>
-              <w:t>Rp.</w:t>
-            </w:r>
-            <w:r>
-              <w:rPr>
-                <w:spacing w:val="50"/>
-              </w:rPr>
-              <w:t xml:space="preserve"> </w:t>
-            </w:r>
-            <w:r>
-              <w:t>{{</w:t>
-            </w:r>
-            <w:r>
-              <w:t>total</w:t>
-            </w:r>
-            <w:r>
-              <w:t>}</w:t>
-            </w:r>
-            <w:r>
-              <w:t>}</w:t>
-            </w:r>
           </w:p>
         </w:tc>
       </w:tr>

</xml_diff>

<commit_message>
chore: update rincian pembayaran template with final formatting
</commit_message>
<xml_diff>
--- a/backend/templates/Berkas Luar Kota - rincian pembayaran.docx
+++ b/backend/templates/Berkas Luar Kota - rincian pembayaran.docx
@@ -1720,19 +1720,12 @@
           <w:tbl>
             <w:tblPr>
               <w:tblStyle w:val="TableGrid"/>
-              <w:tblW w:w="4988" w:type="pct"/>
-              <w:tblBorders>
-                <w:top w:val="none" w:sz="0" w:space="0" w:color="auto"/>
-                <w:left w:val="none" w:sz="0" w:space="0" w:color="auto"/>
-                <w:bottom w:val="none" w:sz="0" w:space="0" w:color="auto"/>
-                <w:right w:val="none" w:sz="0" w:space="0" w:color="auto"/>
-                <w:insideH w:val="none" w:sz="0" w:space="0" w:color="auto"/>
-                <w:insideV w:val="none" w:sz="0" w:space="0" w:color="auto"/>
-              </w:tblBorders>
+              <w:tblW w:w="4603" w:type="pct"/>
+              <w:tblInd w:w="310" w:type="dxa"/>
               <w:tblLook w:val="04A0" w:firstRow="1" w:lastRow="0" w:firstColumn="1" w:lastColumn="0" w:noHBand="0" w:noVBand="1"/>
             </w:tblPr>
             <w:tblGrid>
-              <w:gridCol w:w="4029"/>
+              <w:gridCol w:w="3709"/>
             </w:tblGrid>
             <w:tr>
               <w:tc>

</xml_diff>

<commit_message>
feat: implement hotel extension cost handling in document generation and admin UI
</commit_message>
<xml_diff>
--- a/backend/templates/Berkas Luar Kota - rincian pembayaran.docx
+++ b/backend/templates/Berkas Luar Kota - rincian pembayaran.docx
@@ -1672,8 +1672,8 @@
         <w:tblLook w:val="04A0" w:firstRow="1" w:lastRow="0" w:firstColumn="1" w:lastColumn="0" w:noHBand="0" w:noVBand="1"/>
       </w:tblPr>
       <w:tblGrid>
-        <w:gridCol w:w="6699"/>
-        <w:gridCol w:w="4255"/>
+        <w:gridCol w:w="5325"/>
+        <w:gridCol w:w="5629"/>
       </w:tblGrid>
       <w:tr>
         <w:tc>
@@ -1720,17 +1720,27 @@
           <w:tbl>
             <w:tblPr>
               <w:tblStyle w:val="TableGrid"/>
-              <w:tblW w:w="4603" w:type="pct"/>
-              <w:tblInd w:w="310" w:type="dxa"/>
+              <w:tblW w:w="4142" w:type="dxa"/>
+              <w:tblInd w:w="1271" w:type="dxa"/>
+              <w:tblBorders>
+                <w:top w:val="none" w:sz="0" w:space="0" w:color="auto"/>
+                <w:left w:val="none" w:sz="0" w:space="0" w:color="auto"/>
+                <w:bottom w:val="none" w:sz="0" w:space="0" w:color="auto"/>
+                <w:right w:val="none" w:sz="0" w:space="0" w:color="auto"/>
+                <w:insideH w:val="none" w:sz="0" w:space="0" w:color="auto"/>
+                <w:insideV w:val="none" w:sz="0" w:space="0" w:color="auto"/>
+              </w:tblBorders>
               <w:tblLook w:val="04A0" w:firstRow="1" w:lastRow="0" w:firstColumn="1" w:lastColumn="0" w:noHBand="0" w:noVBand="1"/>
             </w:tblPr>
             <w:tblGrid>
-              <w:gridCol w:w="3709"/>
+              <w:gridCol w:w="283"/>
+              <w:gridCol w:w="3859"/>
             </w:tblGrid>
             <w:tr>
               <w:tc>
                 <w:tcPr>
                   <w:tcW w:w="5000" w:type="pct"/>
+                  <w:gridSpan w:val="2"/>
                 </w:tcPr>
                 <w:p>
                   <w:pPr>
@@ -1754,9 +1764,13 @@
               </w:tc>
             </w:tr>
             <w:tr>
+              <w:trPr>
+                <w:gridBefore w:val="1"/>
+                <w:wBefore w:w="342" w:type="pct"/>
+              </w:trPr>
               <w:tc>
                 <w:tcPr>
-                  <w:tcW w:w="5000" w:type="pct"/>
+                  <w:tcW w:w="4658" w:type="pct"/>
                 </w:tcPr>
                 <w:p>
                   <w:pPr>

</xml_diff>

<commit_message>
chore: update payment detail template
</commit_message>
<xml_diff>
--- a/backend/templates/Berkas Luar Kota - rincian pembayaran.docx
+++ b/backend/templates/Berkas Luar Kota - rincian pembayaran.docx
@@ -1,6 +1,6 @@
 
 <file path=word/document.xml><?xml version="1.0" encoding="utf-8"?>
-<w:document xmlns:wpc="http://schemas.microsoft.com/office/word/2010/wordprocessingCanvas" xmlns:cx="http://schemas.microsoft.com/office/drawing/2014/chartex" xmlns:cx1="http://schemas.microsoft.com/office/drawing/2015/9/8/chartex" xmlns:cx2="http://schemas.microsoft.com/office/drawing/2015/10/21/chartex" xmlns:cx3="http://schemas.microsoft.com/office/drawing/2016/5/9/chartex" xmlns:cx4="http://schemas.microsoft.com/office/drawing/2016/5/10/chartex" xmlns:cx5="http://schemas.microsoft.com/office/drawing/2016/5/11/chartex" xmlns:cx6="http://schemas.microsoft.com/office/drawing/2016/5/12/chartex" xmlns:cx7="http://schemas.microsoft.com/office/drawing/2016/5/13/chartex" xmlns:cx8="http://schemas.microsoft.com/office/drawing/2016/5/14/chartex" xmlns:mc="http://schemas.openxmlformats.org/markup-compatibility/2006" xmlns:aink="http://schemas.microsoft.com/office/drawing/2016/ink" xmlns:am3d="http://schemas.microsoft.com/office/drawing/2017/model3d" xmlns:o="urn:schemas-microsoft-com:office:office" xmlns:oel="http://schemas.microsoft.com/office/2019/extlst" xmlns:r="http://schemas.openxmlformats.org/officeDocument/2006/relationships" xmlns:m="http://schemas.openxmlformats.org/officeDocument/2006/math" xmlns:v="urn:schemas-microsoft-com:vml" xmlns:wp14="http://schemas.microsoft.com/office/word/2010/wordprocessingDrawing" xmlns:wp="http://schemas.openxmlformats.org/drawingml/2006/wordprocessingDrawing" xmlns:w10="urn:schemas-microsoft-com:office:word" xmlns:w="http://schemas.openxmlformats.org/wordprocessingml/2006/main" xmlns:w14="http://schemas.microsoft.com/office/word/2010/wordml" xmlns:w15="http://schemas.microsoft.com/office/word/2012/wordml" xmlns:w16cex="http://schemas.microsoft.com/office/word/2018/wordml/cex" xmlns:w16cid="http://schemas.microsoft.com/office/word/2016/wordml/cid" xmlns:w16="http://schemas.microsoft.com/office/word/2018/wordml" xmlns:w16du="http://schemas.microsoft.com/office/word/2023/wordml/word16du" xmlns:w16sdtdh="http://schemas.microsoft.com/office/word/2020/wordml/sdtdatahash" xmlns:w16sdtfl="http://schemas.microsoft.com/office/word/2024/wordml/sdtformatlock" xmlns:w16se="http://schemas.microsoft.com/office/word/2015/wordml/symex" xmlns:wpg="http://schemas.microsoft.com/office/word/2010/wordprocessingGroup" xmlns:wpi="http://schemas.microsoft.com/office/word/2010/wordprocessingInk" xmlns:wne="http://schemas.microsoft.com/office/word/2006/wordml" xmlns:wps="http://schemas.microsoft.com/office/word/2010/wordprocessingShape" mc:Ignorable="w14 w15 w16se w16cid w16 w16cex w16sdtdh w16sdtfl w16du wp14">
+<w:document xmlns:wpc="http://schemas.microsoft.com/office/word/2010/wordprocessingCanvas" xmlns:cx="http://schemas.microsoft.com/office/drawing/2014/chartex" xmlns:cx1="http://schemas.microsoft.com/office/drawing/2015/9/8/chartex" xmlns:cx2="http://schemas.microsoft.com/office/drawing/2015/10/21/chartex" xmlns:cx3="http://schemas.microsoft.com/office/drawing/2016/5/9/chartex" xmlns:cx4="http://schemas.microsoft.com/office/drawing/2016/5/10/chartex" xmlns:cx5="http://schemas.microsoft.com/office/drawing/2016/5/11/chartex" xmlns:cx6="http://schemas.microsoft.com/office/drawing/2016/5/12/chartex" xmlns:cx7="http://schemas.microsoft.com/office/drawing/2016/5/13/chartex" xmlns:cx8="http://schemas.microsoft.com/office/drawing/2016/5/14/chartex" xmlns:mc="http://schemas.openxmlformats.org/markup-compatibility/2006" xmlns:aink="http://schemas.microsoft.com/office/drawing/2016/ink" xmlns:am3d="http://schemas.microsoft.com/office/drawing/2017/model3d" xmlns:o="urn:schemas-microsoft-com:office:office" xmlns:oel="http://schemas.microsoft.com/office/2019/extlst" xmlns:r="http://schemas.openxmlformats.org/officeDocument/2006/relationships" xmlns:m="http://schemas.openxmlformats.org/officeDocument/2006/math" xmlns:v="urn:schemas-microsoft-com:vml" xmlns:wp14="http://schemas.microsoft.com/office/word/2010/wordprocessingDrawing" xmlns:wp="http://schemas.openxmlformats.org/drawingml/2006/wordprocessingDrawing" xmlns:w10="urn:schemas-microsoft-com:office:word" xmlns:w="http://schemas.openxmlformats.org/wordprocessingml/2006/main" xmlns:w14="http://schemas.microsoft.com/office/word/2010/wordml" xmlns:w15="http://schemas.microsoft.com/office/word/2012/wordml" xmlns:w16cex="http://schemas.microsoft.com/office/word/2018/wordml/cex" xmlns:w16cid="http://schemas.microsoft.com/office/word/2016/wordml/cid" xmlns:w16="http://schemas.microsoft.com/office/word/2018/wordml" xmlns:w16sdtdh="http://schemas.microsoft.com/office/word/2020/wordml/sdtdatahash" xmlns:w16se="http://schemas.microsoft.com/office/word/2015/wordml/symex" xmlns:wpg="http://schemas.microsoft.com/office/word/2010/wordprocessingGroup" xmlns:wpi="http://schemas.microsoft.com/office/word/2010/wordprocessingInk" xmlns:wne="http://schemas.microsoft.com/office/word/2006/wordml" xmlns:wps="http://schemas.microsoft.com/office/word/2010/wordprocessingShape" mc:Ignorable="w14 w15 w16se w16cid w16 w16cex w16sdtdh wp14">
   <w:body>
     <w:p>
       <w:pPr>
@@ -227,21 +227,7 @@
         <w:rPr>
           <w:lang w:val="en-US"/>
         </w:rPr>
-        <w:t>{{</w:t>
-      </w:r>
-      <w:proofErr w:type="spellStart"/>
-      <w:r>
-        <w:rPr>
-          <w:lang w:val="en-US"/>
-        </w:rPr>
-        <w:t>tanggal_no_surat</w:t>
-      </w:r>
-      <w:proofErr w:type="spellEnd"/>
-      <w:r>
-        <w:rPr>
-          <w:lang w:val="en-US"/>
-        </w:rPr>
-        <w:t>}}</w:t>
+        <w:t>{{tanggal_no_surat}}</w:t>
       </w:r>
     </w:p>
     <w:p>
@@ -982,6 +968,9 @@
               <w:spacing w:before="8"/>
               <w:jc w:val="center"/>
             </w:pPr>
+            <w:r>
+              <w:t>2</w:t>
+            </w:r>
           </w:p>
         </w:tc>
         <w:tc>
@@ -1617,33 +1606,33 @@
         <w:t xml:space="preserve"> </w:t>
       </w:r>
       <w:r>
+        <w:t xml:space="preserve">  </w:t>
+      </w:r>
+      <w:r>
+        <w:t xml:space="preserve"> </w:t>
+      </w:r>
+      <w:r>
         <w:t>Jakarta,</w:t>
       </w:r>
       <w:r>
-        <w:rPr>
-          <w:spacing w:val="33"/>
+        <w:t>{{</w:t>
+      </w:r>
+      <w:r>
+        <w:rPr>
           <w:lang w:val="en-US"/>
         </w:rPr>
-        <w:t xml:space="preserve"> </w:t>
-      </w:r>
-      <w:r>
-        <w:t>{{</w:t>
-      </w:r>
-      <w:proofErr w:type="spellStart"/>
+        <w:t>tanggal_</w:t>
+      </w:r>
       <w:r>
         <w:rPr>
           <w:lang w:val="en-US"/>
         </w:rPr>
-        <w:t>tanggal_</w:t>
+        <w:t>dikeluarkan</w:t>
       </w:r>
       <w:r>
         <w:rPr>
           <w:lang w:val="en-US"/>
         </w:rPr>
-        <w:t>dikeluarkan</w:t>
-      </w:r>
-      <w:proofErr w:type="spellEnd"/>
-      <w:r>
         <w:t>}}</w:t>
       </w:r>
       <w:r>
@@ -1653,7 +1642,11 @@
     <w:p>
       <w:pPr>
         <w:pStyle w:val="BodyText"/>
-        <w:spacing w:before="29"/>
+        <w:tabs>
+          <w:tab w:val="left" w:pos="2735"/>
+        </w:tabs>
+        <w:ind w:right="301"/>
+        <w:jc w:val="center"/>
       </w:pPr>
     </w:p>
     <w:tbl>
@@ -1938,25 +1931,7 @@
                 <w:b/>
                 <w:lang w:val="en-US"/>
               </w:rPr>
-              <w:t xml:space="preserve">Yang </w:t>
-            </w:r>
-            <w:proofErr w:type="spellStart"/>
-            <w:r>
-              <w:rPr>
-                <w:rFonts w:ascii="Arial"/>
-                <w:b/>
-                <w:lang w:val="en-US"/>
-              </w:rPr>
-              <w:t>menerima</w:t>
-            </w:r>
-            <w:proofErr w:type="spellEnd"/>
-            <w:r>
-              <w:rPr>
-                <w:rFonts w:ascii="Arial"/>
-                <w:b/>
-                <w:lang w:val="en-US"/>
-              </w:rPr>
-              <w:t>,</w:t>
+              <w:t>Yang menerima,</w:t>
             </w:r>
           </w:p>
         </w:tc>
@@ -2120,88 +2095,60 @@
                 <w:bCs/>
                 <w:lang w:val="en-US"/>
               </w:rPr>
-              <w:t>{{</w:t>
-            </w:r>
-            <w:proofErr w:type="spellStart"/>
-            <w:r>
+              <w:t>{{nama_bendahara}}</w:t>
+            </w:r>
+          </w:p>
+        </w:tc>
+        <w:tc>
+          <w:tcPr>
+            <w:tcW w:w="2268" w:type="dxa"/>
+          </w:tcPr>
+          <w:p>
+            <w:pPr>
+              <w:pStyle w:val="BodyText"/>
+              <w:rPr>
+                <w:rFonts w:ascii="Arial"/>
+                <w:b/>
+              </w:rPr>
+            </w:pPr>
+          </w:p>
+        </w:tc>
+        <w:tc>
+          <w:tcPr>
+            <w:tcW w:w="3969" w:type="dxa"/>
+          </w:tcPr>
+          <w:p>
+            <w:pPr>
+              <w:pStyle w:val="BodyText"/>
+              <w:jc w:val="center"/>
               <w:rPr>
                 <w:rFonts w:ascii="Arial"/>
                 <w:bCs/>
                 <w:lang w:val="en-US"/>
               </w:rPr>
-              <w:t>nama_bendahara</w:t>
-            </w:r>
-            <w:proofErr w:type="spellEnd"/>
+            </w:pPr>
             <w:r>
               <w:rPr>
                 <w:rFonts w:ascii="Arial"/>
                 <w:bCs/>
                 <w:lang w:val="en-US"/>
               </w:rPr>
-              <w:t>}}</w:t>
-            </w:r>
-          </w:p>
-        </w:tc>
-        <w:tc>
-          <w:tcPr>
-            <w:tcW w:w="2268" w:type="dxa"/>
-          </w:tcPr>
-          <w:p>
-            <w:pPr>
-              <w:pStyle w:val="BodyText"/>
-              <w:rPr>
-                <w:rFonts w:ascii="Arial"/>
-                <w:b/>
-              </w:rPr>
-            </w:pPr>
-          </w:p>
-        </w:tc>
-        <w:tc>
-          <w:tcPr>
-            <w:tcW w:w="3969" w:type="dxa"/>
-          </w:tcPr>
-          <w:p>
-            <w:pPr>
-              <w:pStyle w:val="BodyText"/>
-              <w:jc w:val="center"/>
+              <w:t>{{nama_pe</w:t>
+            </w:r>
+            <w:r>
               <w:rPr>
                 <w:rFonts w:ascii="Arial"/>
                 <w:bCs/>
                 <w:lang w:val="en-US"/>
               </w:rPr>
-            </w:pPr>
+              <w:t>tugas</w:t>
+            </w:r>
             <w:r>
               <w:rPr>
                 <w:rFonts w:ascii="Arial"/>
                 <w:bCs/>
                 <w:lang w:val="en-US"/>
               </w:rPr>
-              <w:t>{{</w:t>
-            </w:r>
-            <w:proofErr w:type="spellStart"/>
-            <w:r>
-              <w:rPr>
-                <w:rFonts w:ascii="Arial"/>
-                <w:bCs/>
-                <w:lang w:val="en-US"/>
-              </w:rPr>
-              <w:t>nama_pe</w:t>
-            </w:r>
-            <w:r>
-              <w:rPr>
-                <w:rFonts w:ascii="Arial"/>
-                <w:bCs/>
-                <w:lang w:val="en-US"/>
-              </w:rPr>
-              <w:t>tugas</w:t>
-            </w:r>
-            <w:proofErr w:type="spellEnd"/>
-            <w:r>
-              <w:rPr>
-                <w:rFonts w:ascii="Arial"/>
-                <w:bCs/>
-                <w:lang w:val="en-US"/>
-              </w:rPr>
               <w:t>}}</w:t>
             </w:r>
           </w:p>
@@ -2230,7 +2177,6 @@
               </w:rPr>
               <w:t>NIP. {{</w:t>
             </w:r>
-            <w:proofErr w:type="spellStart"/>
             <w:r>
               <w:rPr>
                 <w:sz w:val="20"/>
@@ -2239,7 +2185,6 @@
               </w:rPr>
               <w:t>nip_bendahara</w:t>
             </w:r>
-            <w:proofErr w:type="spellEnd"/>
             <w:r>
               <w:rPr>
                 <w:sz w:val="20"/>
@@ -2296,7 +2241,6 @@
               </w:rPr>
               <w:t>NIP. {{</w:t>
             </w:r>
-            <w:proofErr w:type="spellStart"/>
             <w:r>
               <w:rPr>
                 <w:sz w:val="20"/>
@@ -2305,7 +2249,6 @@
               </w:rPr>
               <w:t>nip_petugas</w:t>
             </w:r>
-            <w:proofErr w:type="spellEnd"/>
             <w:r>
               <w:rPr>
                 <w:sz w:val="20"/>
@@ -2415,7 +2358,7 @@
               </wp:anchor>
             </w:drawing>
           </mc:Choice>
-          <mc:Fallback>
+          <mc:Fallback xmlns:w16du="http://schemas.microsoft.com/office/word/2023/wordml/word16du" xmlns:w16sdtfl="http://schemas.microsoft.com/office/word/2024/wordml/sdtformatlock">
             <w:pict>
               <v:shape w14:anchorId="4773E7EF" id="Graphic 3" o:spid="_x0000_s1026" style="position:absolute;margin-left:61.95pt;margin-top:4.95pt;width:500.65pt;height:.1pt;z-index:-251667456;visibility:visible;mso-wrap-style:square;mso-wrap-distance-left:0;mso-wrap-distance-top:0;mso-wrap-distance-right:0;mso-wrap-distance-bottom:0;mso-position-horizontal:absolute;mso-position-horizontal-relative:page;mso-position-vertical:absolute;mso-position-vertical-relative:text;v-text-anchor:top" coordsize="6358255,1270" o:gfxdata="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" path="m,l6358128,e" filled="f" strokeweight=".49678mm">
                 <v:path arrowok="t"/>
@@ -2947,7 +2890,7 @@
 </file>
 
 <file path=word/numbering.xml><?xml version="1.0" encoding="utf-8"?>
-<w:numbering xmlns:wpc="http://schemas.microsoft.com/office/word/2010/wordprocessingCanvas" xmlns:cx="http://schemas.microsoft.com/office/drawing/2014/chartex" xmlns:cx1="http://schemas.microsoft.com/office/drawing/2015/9/8/chartex" xmlns:cx2="http://schemas.microsoft.com/office/drawing/2015/10/21/chartex" xmlns:cx3="http://schemas.microsoft.com/office/drawing/2016/5/9/chartex" xmlns:cx4="http://schemas.microsoft.com/office/drawing/2016/5/10/chartex" xmlns:cx5="http://schemas.microsoft.com/office/drawing/2016/5/11/chartex" xmlns:cx6="http://schemas.microsoft.com/office/drawing/2016/5/12/chartex" xmlns:cx7="http://schemas.microsoft.com/office/drawing/2016/5/13/chartex" xmlns:cx8="http://schemas.microsoft.com/office/drawing/2016/5/14/chartex" xmlns:mc="http://schemas.openxmlformats.org/markup-compatibility/2006" xmlns:aink="http://schemas.microsoft.com/office/drawing/2016/ink" xmlns:am3d="http://schemas.microsoft.com/office/drawing/2017/model3d" xmlns:o="urn:schemas-microsoft-com:office:office" xmlns:oel="http://schemas.microsoft.com/office/2019/extlst" xmlns:r="http://schemas.openxmlformats.org/officeDocument/2006/relationships" xmlns:m="http://schemas.openxmlformats.org/officeDocument/2006/math" xmlns:v="urn:schemas-microsoft-com:vml" xmlns:wp14="http://schemas.microsoft.com/office/word/2010/wordprocessingDrawing" xmlns:wp="http://schemas.openxmlformats.org/drawingml/2006/wordprocessingDrawing" xmlns:w10="urn:schemas-microsoft-com:office:word" xmlns:w="http://schemas.openxmlformats.org/wordprocessingml/2006/main" xmlns:w14="http://schemas.microsoft.com/office/word/2010/wordml" xmlns:w15="http://schemas.microsoft.com/office/word/2012/wordml" xmlns:w16cex="http://schemas.microsoft.com/office/word/2018/wordml/cex" xmlns:w16cid="http://schemas.microsoft.com/office/word/2016/wordml/cid" xmlns:w16="http://schemas.microsoft.com/office/word/2018/wordml" xmlns:w16du="http://schemas.microsoft.com/office/word/2023/wordml/word16du" xmlns:w16sdtdh="http://schemas.microsoft.com/office/word/2020/wordml/sdtdatahash" xmlns:w16sdtfl="http://schemas.microsoft.com/office/word/2024/wordml/sdtformatlock" xmlns:w16se="http://schemas.microsoft.com/office/word/2015/wordml/symex" xmlns:wpg="http://schemas.microsoft.com/office/word/2010/wordprocessingGroup" xmlns:wpi="http://schemas.microsoft.com/office/word/2010/wordprocessingInk" xmlns:wne="http://schemas.microsoft.com/office/word/2006/wordml" xmlns:wps="http://schemas.microsoft.com/office/word/2010/wordprocessingShape" mc:Ignorable="w14 w15 w16se w16cid w16 w16cex w16sdtdh w16sdtfl w16du wp14">
+<w:numbering xmlns:wpc="http://schemas.microsoft.com/office/word/2010/wordprocessingCanvas" xmlns:cx="http://schemas.microsoft.com/office/drawing/2014/chartex" xmlns:cx1="http://schemas.microsoft.com/office/drawing/2015/9/8/chartex" xmlns:cx2="http://schemas.microsoft.com/office/drawing/2015/10/21/chartex" xmlns:cx3="http://schemas.microsoft.com/office/drawing/2016/5/9/chartex" xmlns:cx4="http://schemas.microsoft.com/office/drawing/2016/5/10/chartex" xmlns:cx5="http://schemas.microsoft.com/office/drawing/2016/5/11/chartex" xmlns:cx6="http://schemas.microsoft.com/office/drawing/2016/5/12/chartex" xmlns:cx7="http://schemas.microsoft.com/office/drawing/2016/5/13/chartex" xmlns:cx8="http://schemas.microsoft.com/office/drawing/2016/5/14/chartex" xmlns:mc="http://schemas.openxmlformats.org/markup-compatibility/2006" xmlns:aink="http://schemas.microsoft.com/office/drawing/2016/ink" xmlns:am3d="http://schemas.microsoft.com/office/drawing/2017/model3d" xmlns:o="urn:schemas-microsoft-com:office:office" xmlns:oel="http://schemas.microsoft.com/office/2019/extlst" xmlns:r="http://schemas.openxmlformats.org/officeDocument/2006/relationships" xmlns:m="http://schemas.openxmlformats.org/officeDocument/2006/math" xmlns:v="urn:schemas-microsoft-com:vml" xmlns:wp14="http://schemas.microsoft.com/office/word/2010/wordprocessingDrawing" xmlns:wp="http://schemas.openxmlformats.org/drawingml/2006/wordprocessingDrawing" xmlns:w10="urn:schemas-microsoft-com:office:word" xmlns:w="http://schemas.openxmlformats.org/wordprocessingml/2006/main" xmlns:w14="http://schemas.microsoft.com/office/word/2010/wordml" xmlns:w15="http://schemas.microsoft.com/office/word/2012/wordml" xmlns:w16cex="http://schemas.microsoft.com/office/word/2018/wordml/cex" xmlns:w16cid="http://schemas.microsoft.com/office/word/2016/wordml/cid" xmlns:w16="http://schemas.microsoft.com/office/word/2018/wordml" xmlns:w16sdtdh="http://schemas.microsoft.com/office/word/2020/wordml/sdtdatahash" xmlns:w16se="http://schemas.microsoft.com/office/word/2015/wordml/symex" xmlns:wpg="http://schemas.microsoft.com/office/word/2010/wordprocessingGroup" xmlns:wpi="http://schemas.microsoft.com/office/word/2010/wordprocessingInk" xmlns:wne="http://schemas.microsoft.com/office/word/2006/wordml" xmlns:wps="http://schemas.microsoft.com/office/word/2010/wordprocessingShape" mc:Ignorable="w14 w15 w16se w16cid w16 w16cex w16sdtdh wp14">
   <w:abstractNum w:abstractNumId="0" w15:restartNumberingAfterBreak="0">
     <w:nsid w:val="7F8729BB"/>
     <w:multiLevelType w:val="hybridMultilevel"/>
@@ -3070,7 +3013,7 @@
 </file>
 
 <file path=word/styles.xml><?xml version="1.0" encoding="utf-8"?>
-<w:styles xmlns:mc="http://schemas.openxmlformats.org/markup-compatibility/2006" xmlns:r="http://schemas.openxmlformats.org/officeDocument/2006/relationships" xmlns:w="http://schemas.openxmlformats.org/wordprocessingml/2006/main" xmlns:w14="http://schemas.microsoft.com/office/word/2010/wordml" xmlns:w15="http://schemas.microsoft.com/office/word/2012/wordml" xmlns:w16cex="http://schemas.microsoft.com/office/word/2018/wordml/cex" xmlns:w16cid="http://schemas.microsoft.com/office/word/2016/wordml/cid" xmlns:w16="http://schemas.microsoft.com/office/word/2018/wordml" xmlns:w16du="http://schemas.microsoft.com/office/word/2023/wordml/word16du" xmlns:w16sdtdh="http://schemas.microsoft.com/office/word/2020/wordml/sdtdatahash" xmlns:w16sdtfl="http://schemas.microsoft.com/office/word/2024/wordml/sdtformatlock" xmlns:w16se="http://schemas.microsoft.com/office/word/2015/wordml/symex" mc:Ignorable="w14 w15 w16se w16cid w16 w16cex w16sdtdh w16sdtfl w16du">
+<w:styles xmlns:mc="http://schemas.openxmlformats.org/markup-compatibility/2006" xmlns:r="http://schemas.openxmlformats.org/officeDocument/2006/relationships" xmlns:w="http://schemas.openxmlformats.org/wordprocessingml/2006/main" xmlns:w14="http://schemas.microsoft.com/office/word/2010/wordml" xmlns:w15="http://schemas.microsoft.com/office/word/2012/wordml" xmlns:w16cex="http://schemas.microsoft.com/office/word/2018/wordml/cex" xmlns:w16cid="http://schemas.microsoft.com/office/word/2016/wordml/cid" xmlns:w16="http://schemas.microsoft.com/office/word/2018/wordml" xmlns:w16sdtdh="http://schemas.microsoft.com/office/word/2020/wordml/sdtdatahash" xmlns:w16se="http://schemas.microsoft.com/office/word/2015/wordml/symex" mc:Ignorable="w14 w15 w16se w16cid w16 w16cex w16sdtdh">
   <w:docDefaults>
     <w:rPrDefault>
       <w:rPr>

</xml_diff>

<commit_message>
fix: include month and year in tanggal_no_surat even if day is blank
</commit_message>
<xml_diff>
--- a/backend/templates/Berkas Luar Kota - rincian pembayaran.docx
+++ b/backend/templates/Berkas Luar Kota - rincian pembayaran.docx
@@ -1635,6 +1635,9 @@
         <w:t>Jakarta,</w:t>
       </w:r>
       <w:r>
+        <w:t xml:space="preserve"> </w:t>
+      </w:r>
+      <w:r>
         <w:t>{{</w:t>
       </w:r>
       <w:proofErr w:type="spellStart"/>
@@ -1655,7 +1658,7 @@
         <w:rPr>
           <w:lang w:val="en-US"/>
         </w:rPr>
-        <w:t>}}</w:t>
+        <w:t>}</w:t>
       </w:r>
       <w:r>
         <w:tab/>
@@ -2430,7 +2433,7 @@
               </wp:anchor>
             </w:drawing>
           </mc:Choice>
-          <mc:Fallback xmlns:w16sdtfl="http://schemas.microsoft.com/office/word/2024/wordml/sdtformatlock" xmlns:w16du="http://schemas.microsoft.com/office/word/2023/wordml/word16du">
+          <mc:Fallback xmlns:w16du="http://schemas.microsoft.com/office/word/2023/wordml/word16du" xmlns:w16sdtfl="http://schemas.microsoft.com/office/word/2024/wordml/sdtformatlock">
             <w:pict>
               <v:shape w14:anchorId="4773E7EF" id="Graphic 3" o:spid="_x0000_s1026" style="position:absolute;margin-left:61.95pt;margin-top:4.95pt;width:500.65pt;height:.1pt;z-index:-251667456;visibility:visible;mso-wrap-style:square;mso-wrap-distance-left:0;mso-wrap-distance-top:0;mso-wrap-distance-right:0;mso-wrap-distance-bottom:0;mso-position-horizontal:absolute;mso-position-horizontal-relative:page;mso-position-vertical:absolute;mso-position-vertical-relative:text;v-text-anchor:top" coordsize="6358255,1270" o:gfxdata="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" path="m,l6358128,e" filled="f" strokeweight=".49678mm">
                 <v:path arrowok="t"/>

</xml_diff>